<commit_message>
Separate multi-section UI screens into dedicated tabs and add page breaks, figure borders & captions in Word specs
</commit_message>
<xml_diff>
--- a/DAC_TA_CO_SO_DU_LIEU_125_THAI_THINH.docx
+++ b/DAC_TA_CO_SO_DU_LIEU_125_THAI_THINH.docx
@@ -4,8 +4,8 @@
   <w:body>
     <w:p>
       <w:pPr>
-        <w:spacing w:before="200" w:after="80"/>
-        <w:keepNext/>
+        <w:spacing w:before="120" w:after="160"/>
+        <w:keepNext w:val="0"/>
       </w:pPr>
       <w:r>
         <w:rPr>
@@ -20,7 +20,8 @@
     </w:p>
     <w:p>
       <w:pPr>
-        <w:spacing w:before="200" w:after="80"/>
+        <w:pageBreakBefore w:val="0"/>
+        <w:spacing w:before="280" w:after="160"/>
         <w:keepNext/>
       </w:pPr>
       <w:r>
@@ -56,6 +57,7 @@
       <w:tr>
         <w:trPr>
           <w:tblHeader/>
+          <w:cantSplit/>
         </w:trPr>
         <w:tc>
           <w:tcPr>
@@ -194,6 +196,9 @@
         </w:tc>
       </w:tr>
       <w:tr>
+        <w:trPr>
+          <w:cantSplit/>
+        </w:trPr>
         <w:tc>
           <w:tcPr>
             <w:tcW w:w="600" w:type="dxa"/>
@@ -321,6 +326,9 @@
         </w:tc>
       </w:tr>
       <w:tr>
+        <w:trPr>
+          <w:cantSplit/>
+        </w:trPr>
         <w:tc>
           <w:tcPr>
             <w:tcW w:w="600" w:type="dxa"/>
@@ -453,6 +461,9 @@
         </w:tc>
       </w:tr>
       <w:tr>
+        <w:trPr>
+          <w:cantSplit/>
+        </w:trPr>
         <w:tc>
           <w:tcPr>
             <w:tcW w:w="600" w:type="dxa"/>
@@ -580,6 +591,9 @@
         </w:tc>
       </w:tr>
       <w:tr>
+        <w:trPr>
+          <w:cantSplit/>
+        </w:trPr>
         <w:tc>
           <w:tcPr>
             <w:tcW w:w="600" w:type="dxa"/>
@@ -712,6 +726,9 @@
         </w:tc>
       </w:tr>
       <w:tr>
+        <w:trPr>
+          <w:cantSplit/>
+        </w:trPr>
         <w:tc>
           <w:tcPr>
             <w:tcW w:w="600" w:type="dxa"/>
@@ -841,7 +858,8 @@
     </w:tbl>
     <w:p>
       <w:pPr>
-        <w:spacing w:before="200" w:after="80"/>
+        <w:pageBreakBefore/>
+        <w:spacing w:before="360" w:after="160"/>
         <w:keepNext/>
       </w:pPr>
       <w:r>
@@ -877,6 +895,7 @@
       <w:tr>
         <w:trPr>
           <w:tblHeader/>
+          <w:cantSplit/>
         </w:trPr>
         <w:tc>
           <w:tcPr>
@@ -1015,6 +1034,9 @@
         </w:tc>
       </w:tr>
       <w:tr>
+        <w:trPr>
+          <w:cantSplit/>
+        </w:trPr>
         <w:tc>
           <w:tcPr>
             <w:tcW w:w="600" w:type="dxa"/>
@@ -1142,6 +1164,9 @@
         </w:tc>
       </w:tr>
       <w:tr>
+        <w:trPr>
+          <w:cantSplit/>
+        </w:trPr>
         <w:tc>
           <w:tcPr>
             <w:tcW w:w="600" w:type="dxa"/>
@@ -1274,6 +1299,9 @@
         </w:tc>
       </w:tr>
       <w:tr>
+        <w:trPr>
+          <w:cantSplit/>
+        </w:trPr>
         <w:tc>
           <w:tcPr>
             <w:tcW w:w="600" w:type="dxa"/>
@@ -1401,6 +1429,9 @@
         </w:tc>
       </w:tr>
       <w:tr>
+        <w:trPr>
+          <w:cantSplit/>
+        </w:trPr>
         <w:tc>
           <w:tcPr>
             <w:tcW w:w="600" w:type="dxa"/>
@@ -1533,6 +1564,9 @@
         </w:tc>
       </w:tr>
       <w:tr>
+        <w:trPr>
+          <w:cantSplit/>
+        </w:trPr>
         <w:tc>
           <w:tcPr>
             <w:tcW w:w="600" w:type="dxa"/>
@@ -1660,6 +1694,9 @@
         </w:tc>
       </w:tr>
       <w:tr>
+        <w:trPr>
+          <w:cantSplit/>
+        </w:trPr>
         <w:tc>
           <w:tcPr>
             <w:tcW w:w="600" w:type="dxa"/>
@@ -1792,6 +1829,9 @@
         </w:tc>
       </w:tr>
       <w:tr>
+        <w:trPr>
+          <w:cantSplit/>
+        </w:trPr>
         <w:tc>
           <w:tcPr>
             <w:tcW w:w="600" w:type="dxa"/>
@@ -1919,6 +1959,9 @@
         </w:tc>
       </w:tr>
       <w:tr>
+        <w:trPr>
+          <w:cantSplit/>
+        </w:trPr>
         <w:tc>
           <w:tcPr>
             <w:tcW w:w="600" w:type="dxa"/>
@@ -2051,6 +2094,9 @@
         </w:tc>
       </w:tr>
       <w:tr>
+        <w:trPr>
+          <w:cantSplit/>
+        </w:trPr>
         <w:tc>
           <w:tcPr>
             <w:tcW w:w="600" w:type="dxa"/>
@@ -2178,6 +2224,9 @@
         </w:tc>
       </w:tr>
       <w:tr>
+        <w:trPr>
+          <w:cantSplit/>
+        </w:trPr>
         <w:tc>
           <w:tcPr>
             <w:tcW w:w="600" w:type="dxa"/>
@@ -2310,6 +2359,9 @@
         </w:tc>
       </w:tr>
       <w:tr>
+        <w:trPr>
+          <w:cantSplit/>
+        </w:trPr>
         <w:tc>
           <w:tcPr>
             <w:tcW w:w="600" w:type="dxa"/>
@@ -2437,6 +2489,9 @@
         </w:tc>
       </w:tr>
       <w:tr>
+        <w:trPr>
+          <w:cantSplit/>
+        </w:trPr>
         <w:tc>
           <w:tcPr>
             <w:tcW w:w="600" w:type="dxa"/>
@@ -2569,6 +2624,9 @@
         </w:tc>
       </w:tr>
       <w:tr>
+        <w:trPr>
+          <w:cantSplit/>
+        </w:trPr>
         <w:tc>
           <w:tcPr>
             <w:tcW w:w="600" w:type="dxa"/>
@@ -2696,6 +2754,9 @@
         </w:tc>
       </w:tr>
       <w:tr>
+        <w:trPr>
+          <w:cantSplit/>
+        </w:trPr>
         <w:tc>
           <w:tcPr>
             <w:tcW w:w="600" w:type="dxa"/>
@@ -2830,7 +2891,8 @@
     </w:tbl>
     <w:p>
       <w:pPr>
-        <w:spacing w:before="200" w:after="80"/>
+        <w:pageBreakBefore/>
+        <w:spacing w:before="360" w:after="160"/>
         <w:keepNext/>
       </w:pPr>
       <w:r>
@@ -2866,6 +2928,7 @@
       <w:tr>
         <w:trPr>
           <w:tblHeader/>
+          <w:cantSplit/>
         </w:trPr>
         <w:tc>
           <w:tcPr>
@@ -3004,6 +3067,9 @@
         </w:tc>
       </w:tr>
       <w:tr>
+        <w:trPr>
+          <w:cantSplit/>
+        </w:trPr>
         <w:tc>
           <w:tcPr>
             <w:tcW w:w="600" w:type="dxa"/>
@@ -3131,6 +3197,9 @@
         </w:tc>
       </w:tr>
       <w:tr>
+        <w:trPr>
+          <w:cantSplit/>
+        </w:trPr>
         <w:tc>
           <w:tcPr>
             <w:tcW w:w="600" w:type="dxa"/>
@@ -3263,6 +3332,9 @@
         </w:tc>
       </w:tr>
       <w:tr>
+        <w:trPr>
+          <w:cantSplit/>
+        </w:trPr>
         <w:tc>
           <w:tcPr>
             <w:tcW w:w="600" w:type="dxa"/>
@@ -3390,6 +3462,9 @@
         </w:tc>
       </w:tr>
       <w:tr>
+        <w:trPr>
+          <w:cantSplit/>
+        </w:trPr>
         <w:tc>
           <w:tcPr>
             <w:tcW w:w="600" w:type="dxa"/>
@@ -3522,6 +3597,9 @@
         </w:tc>
       </w:tr>
       <w:tr>
+        <w:trPr>
+          <w:cantSplit/>
+        </w:trPr>
         <w:tc>
           <w:tcPr>
             <w:tcW w:w="600" w:type="dxa"/>
@@ -3649,6 +3727,9 @@
         </w:tc>
       </w:tr>
       <w:tr>
+        <w:trPr>
+          <w:cantSplit/>
+        </w:trPr>
         <w:tc>
           <w:tcPr>
             <w:tcW w:w="600" w:type="dxa"/>
@@ -3781,6 +3862,9 @@
         </w:tc>
       </w:tr>
       <w:tr>
+        <w:trPr>
+          <w:cantSplit/>
+        </w:trPr>
         <w:tc>
           <w:tcPr>
             <w:tcW w:w="600" w:type="dxa"/>
@@ -3908,6 +3992,9 @@
         </w:tc>
       </w:tr>
       <w:tr>
+        <w:trPr>
+          <w:cantSplit/>
+        </w:trPr>
         <w:tc>
           <w:tcPr>
             <w:tcW w:w="600" w:type="dxa"/>
@@ -4040,6 +4127,9 @@
         </w:tc>
       </w:tr>
       <w:tr>
+        <w:trPr>
+          <w:cantSplit/>
+        </w:trPr>
         <w:tc>
           <w:tcPr>
             <w:tcW w:w="600" w:type="dxa"/>
@@ -4167,6 +4257,9 @@
         </w:tc>
       </w:tr>
       <w:tr>
+        <w:trPr>
+          <w:cantSplit/>
+        </w:trPr>
         <w:tc>
           <w:tcPr>
             <w:tcW w:w="600" w:type="dxa"/>
@@ -4299,6 +4392,9 @@
         </w:tc>
       </w:tr>
       <w:tr>
+        <w:trPr>
+          <w:cantSplit/>
+        </w:trPr>
         <w:tc>
           <w:tcPr>
             <w:tcW w:w="600" w:type="dxa"/>
@@ -4426,6 +4522,9 @@
         </w:tc>
       </w:tr>
       <w:tr>
+        <w:trPr>
+          <w:cantSplit/>
+        </w:trPr>
         <w:tc>
           <w:tcPr>
             <w:tcW w:w="600" w:type="dxa"/>
@@ -4560,7 +4659,8 @@
     </w:tbl>
     <w:p>
       <w:pPr>
-        <w:spacing w:before="200" w:after="80"/>
+        <w:pageBreakBefore/>
+        <w:spacing w:before="360" w:after="160"/>
         <w:keepNext/>
       </w:pPr>
       <w:r>
@@ -4596,6 +4696,7 @@
       <w:tr>
         <w:trPr>
           <w:tblHeader/>
+          <w:cantSplit/>
         </w:trPr>
         <w:tc>
           <w:tcPr>
@@ -4734,6 +4835,9 @@
         </w:tc>
       </w:tr>
       <w:tr>
+        <w:trPr>
+          <w:cantSplit/>
+        </w:trPr>
         <w:tc>
           <w:tcPr>
             <w:tcW w:w="600" w:type="dxa"/>
@@ -4861,6 +4965,9 @@
         </w:tc>
       </w:tr>
       <w:tr>
+        <w:trPr>
+          <w:cantSplit/>
+        </w:trPr>
         <w:tc>
           <w:tcPr>
             <w:tcW w:w="600" w:type="dxa"/>
@@ -4993,6 +5100,9 @@
         </w:tc>
       </w:tr>
       <w:tr>
+        <w:trPr>
+          <w:cantSplit/>
+        </w:trPr>
         <w:tc>
           <w:tcPr>
             <w:tcW w:w="600" w:type="dxa"/>
@@ -5120,6 +5230,9 @@
         </w:tc>
       </w:tr>
       <w:tr>
+        <w:trPr>
+          <w:cantSplit/>
+        </w:trPr>
         <w:tc>
           <w:tcPr>
             <w:tcW w:w="600" w:type="dxa"/>
@@ -5252,6 +5365,9 @@
         </w:tc>
       </w:tr>
       <w:tr>
+        <w:trPr>
+          <w:cantSplit/>
+        </w:trPr>
         <w:tc>
           <w:tcPr>
             <w:tcW w:w="600" w:type="dxa"/>
@@ -5379,6 +5495,9 @@
         </w:tc>
       </w:tr>
       <w:tr>
+        <w:trPr>
+          <w:cantSplit/>
+        </w:trPr>
         <w:tc>
           <w:tcPr>
             <w:tcW w:w="600" w:type="dxa"/>
@@ -5511,6 +5630,9 @@
         </w:tc>
       </w:tr>
       <w:tr>
+        <w:trPr>
+          <w:cantSplit/>
+        </w:trPr>
         <w:tc>
           <w:tcPr>
             <w:tcW w:w="600" w:type="dxa"/>
@@ -5640,7 +5762,8 @@
     </w:tbl>
     <w:p>
       <w:pPr>
-        <w:spacing w:before="200" w:after="80"/>
+        <w:pageBreakBefore/>
+        <w:spacing w:before="360" w:after="160"/>
         <w:keepNext/>
       </w:pPr>
       <w:r>
@@ -5676,6 +5799,7 @@
       <w:tr>
         <w:trPr>
           <w:tblHeader/>
+          <w:cantSplit/>
         </w:trPr>
         <w:tc>
           <w:tcPr>
@@ -5814,6 +5938,9 @@
         </w:tc>
       </w:tr>
       <w:tr>
+        <w:trPr>
+          <w:cantSplit/>
+        </w:trPr>
         <w:tc>
           <w:tcPr>
             <w:tcW w:w="600" w:type="dxa"/>
@@ -5941,6 +6068,9 @@
         </w:tc>
       </w:tr>
       <w:tr>
+        <w:trPr>
+          <w:cantSplit/>
+        </w:trPr>
         <w:tc>
           <w:tcPr>
             <w:tcW w:w="600" w:type="dxa"/>
@@ -6073,6 +6203,9 @@
         </w:tc>
       </w:tr>
       <w:tr>
+        <w:trPr>
+          <w:cantSplit/>
+        </w:trPr>
         <w:tc>
           <w:tcPr>
             <w:tcW w:w="600" w:type="dxa"/>
@@ -6200,6 +6333,9 @@
         </w:tc>
       </w:tr>
       <w:tr>
+        <w:trPr>
+          <w:cantSplit/>
+        </w:trPr>
         <w:tc>
           <w:tcPr>
             <w:tcW w:w="600" w:type="dxa"/>
@@ -6332,6 +6468,9 @@
         </w:tc>
       </w:tr>
       <w:tr>
+        <w:trPr>
+          <w:cantSplit/>
+        </w:trPr>
         <w:tc>
           <w:tcPr>
             <w:tcW w:w="600" w:type="dxa"/>
@@ -6459,6 +6598,9 @@
         </w:tc>
       </w:tr>
       <w:tr>
+        <w:trPr>
+          <w:cantSplit/>
+        </w:trPr>
         <w:tc>
           <w:tcPr>
             <w:tcW w:w="600" w:type="dxa"/>
@@ -6591,6 +6733,9 @@
         </w:tc>
       </w:tr>
       <w:tr>
+        <w:trPr>
+          <w:cantSplit/>
+        </w:trPr>
         <w:tc>
           <w:tcPr>
             <w:tcW w:w="600" w:type="dxa"/>
@@ -6718,6 +6863,9 @@
         </w:tc>
       </w:tr>
       <w:tr>
+        <w:trPr>
+          <w:cantSplit/>
+        </w:trPr>
         <w:tc>
           <w:tcPr>
             <w:tcW w:w="600" w:type="dxa"/>
@@ -6850,6 +6998,9 @@
         </w:tc>
       </w:tr>
       <w:tr>
+        <w:trPr>
+          <w:cantSplit/>
+        </w:trPr>
         <w:tc>
           <w:tcPr>
             <w:tcW w:w="600" w:type="dxa"/>
@@ -6977,6 +7128,9 @@
         </w:tc>
       </w:tr>
       <w:tr>
+        <w:trPr>
+          <w:cantSplit/>
+        </w:trPr>
         <w:tc>
           <w:tcPr>
             <w:tcW w:w="600" w:type="dxa"/>
@@ -7109,6 +7263,9 @@
         </w:tc>
       </w:tr>
       <w:tr>
+        <w:trPr>
+          <w:cantSplit/>
+        </w:trPr>
         <w:tc>
           <w:tcPr>
             <w:tcW w:w="600" w:type="dxa"/>
@@ -7236,6 +7393,9 @@
         </w:tc>
       </w:tr>
       <w:tr>
+        <w:trPr>
+          <w:cantSplit/>
+        </w:trPr>
         <w:tc>
           <w:tcPr>
             <w:tcW w:w="600" w:type="dxa"/>
@@ -7368,6 +7528,9 @@
         </w:tc>
       </w:tr>
       <w:tr>
+        <w:trPr>
+          <w:cantSplit/>
+        </w:trPr>
         <w:tc>
           <w:tcPr>
             <w:tcW w:w="600" w:type="dxa"/>
@@ -7502,7 +7665,8 @@
     </w:tbl>
     <w:p>
       <w:pPr>
-        <w:spacing w:before="200" w:after="80"/>
+        <w:pageBreakBefore/>
+        <w:spacing w:before="360" w:after="160"/>
         <w:keepNext/>
       </w:pPr>
       <w:r>
@@ -7538,6 +7702,7 @@
       <w:tr>
         <w:trPr>
           <w:tblHeader/>
+          <w:cantSplit/>
         </w:trPr>
         <w:tc>
           <w:tcPr>
@@ -7676,6 +7841,9 @@
         </w:tc>
       </w:tr>
       <w:tr>
+        <w:trPr>
+          <w:cantSplit/>
+        </w:trPr>
         <w:tc>
           <w:tcPr>
             <w:tcW w:w="600" w:type="dxa"/>
@@ -7803,6 +7971,9 @@
         </w:tc>
       </w:tr>
       <w:tr>
+        <w:trPr>
+          <w:cantSplit/>
+        </w:trPr>
         <w:tc>
           <w:tcPr>
             <w:tcW w:w="600" w:type="dxa"/>
@@ -7935,6 +8106,9 @@
         </w:tc>
       </w:tr>
       <w:tr>
+        <w:trPr>
+          <w:cantSplit/>
+        </w:trPr>
         <w:tc>
           <w:tcPr>
             <w:tcW w:w="600" w:type="dxa"/>
@@ -8062,6 +8236,9 @@
         </w:tc>
       </w:tr>
       <w:tr>
+        <w:trPr>
+          <w:cantSplit/>
+        </w:trPr>
         <w:tc>
           <w:tcPr>
             <w:tcW w:w="600" w:type="dxa"/>
@@ -8194,6 +8371,9 @@
         </w:tc>
       </w:tr>
       <w:tr>
+        <w:trPr>
+          <w:cantSplit/>
+        </w:trPr>
         <w:tc>
           <w:tcPr>
             <w:tcW w:w="600" w:type="dxa"/>
@@ -8321,6 +8501,9 @@
         </w:tc>
       </w:tr>
       <w:tr>
+        <w:trPr>
+          <w:cantSplit/>
+        </w:trPr>
         <w:tc>
           <w:tcPr>
             <w:tcW w:w="600" w:type="dxa"/>
@@ -8453,6 +8636,9 @@
         </w:tc>
       </w:tr>
       <w:tr>
+        <w:trPr>
+          <w:cantSplit/>
+        </w:trPr>
         <w:tc>
           <w:tcPr>
             <w:tcW w:w="600" w:type="dxa"/>
@@ -8580,6 +8766,9 @@
         </w:tc>
       </w:tr>
       <w:tr>
+        <w:trPr>
+          <w:cantSplit/>
+        </w:trPr>
         <w:tc>
           <w:tcPr>
             <w:tcW w:w="600" w:type="dxa"/>
@@ -8714,7 +8903,8 @@
     </w:tbl>
     <w:p>
       <w:pPr>
-        <w:spacing w:before="200" w:after="80"/>
+        <w:pageBreakBefore/>
+        <w:spacing w:before="360" w:after="160"/>
         <w:keepNext/>
       </w:pPr>
       <w:r>
@@ -8750,6 +8940,7 @@
       <w:tr>
         <w:trPr>
           <w:tblHeader/>
+          <w:cantSplit/>
         </w:trPr>
         <w:tc>
           <w:tcPr>
@@ -8888,6 +9079,9 @@
         </w:tc>
       </w:tr>
       <w:tr>
+        <w:trPr>
+          <w:cantSplit/>
+        </w:trPr>
         <w:tc>
           <w:tcPr>
             <w:tcW w:w="600" w:type="dxa"/>
@@ -9015,6 +9209,9 @@
         </w:tc>
       </w:tr>
       <w:tr>
+        <w:trPr>
+          <w:cantSplit/>
+        </w:trPr>
         <w:tc>
           <w:tcPr>
             <w:tcW w:w="600" w:type="dxa"/>
@@ -9147,6 +9344,9 @@
         </w:tc>
       </w:tr>
       <w:tr>
+        <w:trPr>
+          <w:cantSplit/>
+        </w:trPr>
         <w:tc>
           <w:tcPr>
             <w:tcW w:w="600" w:type="dxa"/>
@@ -9274,6 +9474,9 @@
         </w:tc>
       </w:tr>
       <w:tr>
+        <w:trPr>
+          <w:cantSplit/>
+        </w:trPr>
         <w:tc>
           <w:tcPr>
             <w:tcW w:w="600" w:type="dxa"/>
@@ -9406,6 +9609,9 @@
         </w:tc>
       </w:tr>
       <w:tr>
+        <w:trPr>
+          <w:cantSplit/>
+        </w:trPr>
         <w:tc>
           <w:tcPr>
             <w:tcW w:w="600" w:type="dxa"/>
@@ -9535,7 +9741,8 @@
     </w:tbl>
     <w:p>
       <w:pPr>
-        <w:spacing w:before="200" w:after="80"/>
+        <w:pageBreakBefore/>
+        <w:spacing w:before="360" w:after="160"/>
         <w:keepNext/>
       </w:pPr>
       <w:r>
@@ -9571,6 +9778,7 @@
       <w:tr>
         <w:trPr>
           <w:tblHeader/>
+          <w:cantSplit/>
         </w:trPr>
         <w:tc>
           <w:tcPr>
@@ -9709,6 +9917,9 @@
         </w:tc>
       </w:tr>
       <w:tr>
+        <w:trPr>
+          <w:cantSplit/>
+        </w:trPr>
         <w:tc>
           <w:tcPr>
             <w:tcW w:w="600" w:type="dxa"/>
@@ -9836,6 +10047,9 @@
         </w:tc>
       </w:tr>
       <w:tr>
+        <w:trPr>
+          <w:cantSplit/>
+        </w:trPr>
         <w:tc>
           <w:tcPr>
             <w:tcW w:w="600" w:type="dxa"/>
@@ -9968,6 +10182,9 @@
         </w:tc>
       </w:tr>
       <w:tr>
+        <w:trPr>
+          <w:cantSplit/>
+        </w:trPr>
         <w:tc>
           <w:tcPr>
             <w:tcW w:w="600" w:type="dxa"/>
@@ -10095,6 +10312,9 @@
         </w:tc>
       </w:tr>
       <w:tr>
+        <w:trPr>
+          <w:cantSplit/>
+        </w:trPr>
         <w:tc>
           <w:tcPr>
             <w:tcW w:w="600" w:type="dxa"/>
@@ -10227,6 +10447,9 @@
         </w:tc>
       </w:tr>
       <w:tr>
+        <w:trPr>
+          <w:cantSplit/>
+        </w:trPr>
         <w:tc>
           <w:tcPr>
             <w:tcW w:w="600" w:type="dxa"/>
@@ -10354,6 +10577,9 @@
         </w:tc>
       </w:tr>
       <w:tr>
+        <w:trPr>
+          <w:cantSplit/>
+        </w:trPr>
         <w:tc>
           <w:tcPr>
             <w:tcW w:w="600" w:type="dxa"/>
@@ -10486,6 +10712,9 @@
         </w:tc>
       </w:tr>
       <w:tr>
+        <w:trPr>
+          <w:cantSplit/>
+        </w:trPr>
         <w:tc>
           <w:tcPr>
             <w:tcW w:w="600" w:type="dxa"/>
@@ -10615,7 +10844,8 @@
     </w:tbl>
     <w:p>
       <w:pPr>
-        <w:spacing w:before="200" w:after="80"/>
+        <w:pageBreakBefore/>
+        <w:spacing w:before="360" w:after="160"/>
         <w:keepNext/>
       </w:pPr>
       <w:r>
@@ -10651,6 +10881,7 @@
       <w:tr>
         <w:trPr>
           <w:tblHeader/>
+          <w:cantSplit/>
         </w:trPr>
         <w:tc>
           <w:tcPr>
@@ -10789,6 +11020,9 @@
         </w:tc>
       </w:tr>
       <w:tr>
+        <w:trPr>
+          <w:cantSplit/>
+        </w:trPr>
         <w:tc>
           <w:tcPr>
             <w:tcW w:w="600" w:type="dxa"/>
@@ -10916,6 +11150,9 @@
         </w:tc>
       </w:tr>
       <w:tr>
+        <w:trPr>
+          <w:cantSplit/>
+        </w:trPr>
         <w:tc>
           <w:tcPr>
             <w:tcW w:w="600" w:type="dxa"/>
@@ -11048,6 +11285,9 @@
         </w:tc>
       </w:tr>
       <w:tr>
+        <w:trPr>
+          <w:cantSplit/>
+        </w:trPr>
         <w:tc>
           <w:tcPr>
             <w:tcW w:w="600" w:type="dxa"/>
@@ -11175,6 +11415,9 @@
         </w:tc>
       </w:tr>
       <w:tr>
+        <w:trPr>
+          <w:cantSplit/>
+        </w:trPr>
         <w:tc>
           <w:tcPr>
             <w:tcW w:w="600" w:type="dxa"/>
@@ -11307,6 +11550,9 @@
         </w:tc>
       </w:tr>
       <w:tr>
+        <w:trPr>
+          <w:cantSplit/>
+        </w:trPr>
         <w:tc>
           <w:tcPr>
             <w:tcW w:w="600" w:type="dxa"/>
@@ -11436,7 +11682,8 @@
     </w:tbl>
     <w:p>
       <w:pPr>
-        <w:spacing w:before="200" w:after="80"/>
+        <w:pageBreakBefore/>
+        <w:spacing w:before="360" w:after="160"/>
         <w:keepNext/>
       </w:pPr>
       <w:r>
@@ -11472,6 +11719,7 @@
       <w:tr>
         <w:trPr>
           <w:tblHeader/>
+          <w:cantSplit/>
         </w:trPr>
         <w:tc>
           <w:tcPr>
@@ -11610,6 +11858,9 @@
         </w:tc>
       </w:tr>
       <w:tr>
+        <w:trPr>
+          <w:cantSplit/>
+        </w:trPr>
         <w:tc>
           <w:tcPr>
             <w:tcW w:w="600" w:type="dxa"/>
@@ -11737,6 +11988,9 @@
         </w:tc>
       </w:tr>
       <w:tr>
+        <w:trPr>
+          <w:cantSplit/>
+        </w:trPr>
         <w:tc>
           <w:tcPr>
             <w:tcW w:w="600" w:type="dxa"/>
@@ -11869,6 +12123,9 @@
         </w:tc>
       </w:tr>
       <w:tr>
+        <w:trPr>
+          <w:cantSplit/>
+        </w:trPr>
         <w:tc>
           <w:tcPr>
             <w:tcW w:w="600" w:type="dxa"/>
@@ -11996,6 +12253,9 @@
         </w:tc>
       </w:tr>
       <w:tr>
+        <w:trPr>
+          <w:cantSplit/>
+        </w:trPr>
         <w:tc>
           <w:tcPr>
             <w:tcW w:w="600" w:type="dxa"/>
@@ -12128,6 +12388,9 @@
         </w:tc>
       </w:tr>
       <w:tr>
+        <w:trPr>
+          <w:cantSplit/>
+        </w:trPr>
         <w:tc>
           <w:tcPr>
             <w:tcW w:w="600" w:type="dxa"/>
@@ -12255,6 +12518,9 @@
         </w:tc>
       </w:tr>
       <w:tr>
+        <w:trPr>
+          <w:cantSplit/>
+        </w:trPr>
         <w:tc>
           <w:tcPr>
             <w:tcW w:w="600" w:type="dxa"/>
@@ -12387,6 +12653,9 @@
         </w:tc>
       </w:tr>
       <w:tr>
+        <w:trPr>
+          <w:cantSplit/>
+        </w:trPr>
         <w:tc>
           <w:tcPr>
             <w:tcW w:w="600" w:type="dxa"/>
@@ -12514,6 +12783,9 @@
         </w:tc>
       </w:tr>
       <w:tr>
+        <w:trPr>
+          <w:cantSplit/>
+        </w:trPr>
         <w:tc>
           <w:tcPr>
             <w:tcW w:w="600" w:type="dxa"/>
@@ -12646,6 +12918,9 @@
         </w:tc>
       </w:tr>
       <w:tr>
+        <w:trPr>
+          <w:cantSplit/>
+        </w:trPr>
         <w:tc>
           <w:tcPr>
             <w:tcW w:w="600" w:type="dxa"/>
@@ -12773,6 +13048,9 @@
         </w:tc>
       </w:tr>
       <w:tr>
+        <w:trPr>
+          <w:cantSplit/>
+        </w:trPr>
         <w:tc>
           <w:tcPr>
             <w:tcW w:w="600" w:type="dxa"/>
@@ -12907,7 +13185,8 @@
     </w:tbl>
     <w:p>
       <w:pPr>
-        <w:spacing w:before="200" w:after="80"/>
+        <w:pageBreakBefore/>
+        <w:spacing w:before="360" w:after="160"/>
         <w:keepNext/>
       </w:pPr>
       <w:r>
@@ -12943,6 +13222,7 @@
       <w:tr>
         <w:trPr>
           <w:tblHeader/>
+          <w:cantSplit/>
         </w:trPr>
         <w:tc>
           <w:tcPr>
@@ -13081,6 +13361,9 @@
         </w:tc>
       </w:tr>
       <w:tr>
+        <w:trPr>
+          <w:cantSplit/>
+        </w:trPr>
         <w:tc>
           <w:tcPr>
             <w:tcW w:w="600" w:type="dxa"/>
@@ -13208,6 +13491,9 @@
         </w:tc>
       </w:tr>
       <w:tr>
+        <w:trPr>
+          <w:cantSplit/>
+        </w:trPr>
         <w:tc>
           <w:tcPr>
             <w:tcW w:w="600" w:type="dxa"/>
@@ -13340,6 +13626,9 @@
         </w:tc>
       </w:tr>
       <w:tr>
+        <w:trPr>
+          <w:cantSplit/>
+        </w:trPr>
         <w:tc>
           <w:tcPr>
             <w:tcW w:w="600" w:type="dxa"/>
@@ -13467,6 +13756,9 @@
         </w:tc>
       </w:tr>
       <w:tr>
+        <w:trPr>
+          <w:cantSplit/>
+        </w:trPr>
         <w:tc>
           <w:tcPr>
             <w:tcW w:w="600" w:type="dxa"/>
@@ -13599,6 +13891,9 @@
         </w:tc>
       </w:tr>
       <w:tr>
+        <w:trPr>
+          <w:cantSplit/>
+        </w:trPr>
         <w:tc>
           <w:tcPr>
             <w:tcW w:w="600" w:type="dxa"/>
@@ -13726,6 +14021,9 @@
         </w:tc>
       </w:tr>
       <w:tr>
+        <w:trPr>
+          <w:cantSplit/>
+        </w:trPr>
         <w:tc>
           <w:tcPr>
             <w:tcW w:w="600" w:type="dxa"/>
@@ -13858,6 +14156,9 @@
         </w:tc>
       </w:tr>
       <w:tr>
+        <w:trPr>
+          <w:cantSplit/>
+        </w:trPr>
         <w:tc>
           <w:tcPr>
             <w:tcW w:w="600" w:type="dxa"/>
@@ -13985,6 +14286,9 @@
         </w:tc>
       </w:tr>
       <w:tr>
+        <w:trPr>
+          <w:cantSplit/>
+        </w:trPr>
         <w:tc>
           <w:tcPr>
             <w:tcW w:w="600" w:type="dxa"/>
@@ -14117,6 +14421,9 @@
         </w:tc>
       </w:tr>
       <w:tr>
+        <w:trPr>
+          <w:cantSplit/>
+        </w:trPr>
         <w:tc>
           <w:tcPr>
             <w:tcW w:w="600" w:type="dxa"/>
@@ -14244,6 +14551,9 @@
         </w:tc>
       </w:tr>
       <w:tr>
+        <w:trPr>
+          <w:cantSplit/>
+        </w:trPr>
         <w:tc>
           <w:tcPr>
             <w:tcW w:w="600" w:type="dxa"/>
@@ -14376,6 +14686,9 @@
         </w:tc>
       </w:tr>
       <w:tr>
+        <w:trPr>
+          <w:cantSplit/>
+        </w:trPr>
         <w:tc>
           <w:tcPr>
             <w:tcW w:w="600" w:type="dxa"/>
@@ -14503,6 +14816,9 @@
         </w:tc>
       </w:tr>
       <w:tr>
+        <w:trPr>
+          <w:cantSplit/>
+        </w:trPr>
         <w:tc>
           <w:tcPr>
             <w:tcW w:w="600" w:type="dxa"/>
@@ -14637,7 +14953,8 @@
     </w:tbl>
     <w:p>
       <w:pPr>
-        <w:spacing w:before="200" w:after="80"/>
+        <w:pageBreakBefore/>
+        <w:spacing w:before="360" w:after="160"/>
         <w:keepNext/>
       </w:pPr>
       <w:r>
@@ -14673,6 +14990,7 @@
       <w:tr>
         <w:trPr>
           <w:tblHeader/>
+          <w:cantSplit/>
         </w:trPr>
         <w:tc>
           <w:tcPr>
@@ -14811,6 +15129,9 @@
         </w:tc>
       </w:tr>
       <w:tr>
+        <w:trPr>
+          <w:cantSplit/>
+        </w:trPr>
         <w:tc>
           <w:tcPr>
             <w:tcW w:w="600" w:type="dxa"/>
@@ -14938,6 +15259,9 @@
         </w:tc>
       </w:tr>
       <w:tr>
+        <w:trPr>
+          <w:cantSplit/>
+        </w:trPr>
         <w:tc>
           <w:tcPr>
             <w:tcW w:w="600" w:type="dxa"/>
@@ -15070,6 +15394,9 @@
         </w:tc>
       </w:tr>
       <w:tr>
+        <w:trPr>
+          <w:cantSplit/>
+        </w:trPr>
         <w:tc>
           <w:tcPr>
             <w:tcW w:w="600" w:type="dxa"/>
@@ -15197,6 +15524,9 @@
         </w:tc>
       </w:tr>
       <w:tr>
+        <w:trPr>
+          <w:cantSplit/>
+        </w:trPr>
         <w:tc>
           <w:tcPr>
             <w:tcW w:w="600" w:type="dxa"/>
@@ -15329,6 +15659,9 @@
         </w:tc>
       </w:tr>
       <w:tr>
+        <w:trPr>
+          <w:cantSplit/>
+        </w:trPr>
         <w:tc>
           <w:tcPr>
             <w:tcW w:w="600" w:type="dxa"/>
@@ -15456,6 +15789,9 @@
         </w:tc>
       </w:tr>
       <w:tr>
+        <w:trPr>
+          <w:cantSplit/>
+        </w:trPr>
         <w:tc>
           <w:tcPr>
             <w:tcW w:w="600" w:type="dxa"/>
@@ -15588,6 +15924,9 @@
         </w:tc>
       </w:tr>
       <w:tr>
+        <w:trPr>
+          <w:cantSplit/>
+        </w:trPr>
         <w:tc>
           <w:tcPr>
             <w:tcW w:w="600" w:type="dxa"/>
@@ -15715,6 +16054,9 @@
         </w:tc>
       </w:tr>
       <w:tr>
+        <w:trPr>
+          <w:cantSplit/>
+        </w:trPr>
         <w:tc>
           <w:tcPr>
             <w:tcW w:w="600" w:type="dxa"/>
@@ -15847,6 +16189,9 @@
         </w:tc>
       </w:tr>
       <w:tr>
+        <w:trPr>
+          <w:cantSplit/>
+        </w:trPr>
         <w:tc>
           <w:tcPr>
             <w:tcW w:w="600" w:type="dxa"/>
@@ -15974,6 +16319,9 @@
         </w:tc>
       </w:tr>
       <w:tr>
+        <w:trPr>
+          <w:cantSplit/>
+        </w:trPr>
         <w:tc>
           <w:tcPr>
             <w:tcW w:w="600" w:type="dxa"/>
@@ -16106,6 +16454,9 @@
         </w:tc>
       </w:tr>
       <w:tr>
+        <w:trPr>
+          <w:cantSplit/>
+        </w:trPr>
         <w:tc>
           <w:tcPr>
             <w:tcW w:w="600" w:type="dxa"/>
@@ -16233,6 +16584,9 @@
         </w:tc>
       </w:tr>
       <w:tr>
+        <w:trPr>
+          <w:cantSplit/>
+        </w:trPr>
         <w:tc>
           <w:tcPr>
             <w:tcW w:w="600" w:type="dxa"/>
@@ -16365,6 +16719,9 @@
         </w:tc>
       </w:tr>
       <w:tr>
+        <w:trPr>
+          <w:cantSplit/>
+        </w:trPr>
         <w:tc>
           <w:tcPr>
             <w:tcW w:w="600" w:type="dxa"/>
@@ -16492,6 +16849,9 @@
         </w:tc>
       </w:tr>
       <w:tr>
+        <w:trPr>
+          <w:cantSplit/>
+        </w:trPr>
         <w:tc>
           <w:tcPr>
             <w:tcW w:w="600" w:type="dxa"/>
@@ -16624,6 +16984,9 @@
         </w:tc>
       </w:tr>
       <w:tr>
+        <w:trPr>
+          <w:cantSplit/>
+        </w:trPr>
         <w:tc>
           <w:tcPr>
             <w:tcW w:w="600" w:type="dxa"/>
@@ -16751,6 +17114,9 @@
         </w:tc>
       </w:tr>
       <w:tr>
+        <w:trPr>
+          <w:cantSplit/>
+        </w:trPr>
         <w:tc>
           <w:tcPr>
             <w:tcW w:w="600" w:type="dxa"/>
@@ -16883,6 +17249,9 @@
         </w:tc>
       </w:tr>
       <w:tr>
+        <w:trPr>
+          <w:cantSplit/>
+        </w:trPr>
         <w:tc>
           <w:tcPr>
             <w:tcW w:w="600" w:type="dxa"/>
@@ -17010,6 +17379,9 @@
         </w:tc>
       </w:tr>
       <w:tr>
+        <w:trPr>
+          <w:cantSplit/>
+        </w:trPr>
         <w:tc>
           <w:tcPr>
             <w:tcW w:w="600" w:type="dxa"/>
@@ -17142,6 +17514,9 @@
         </w:tc>
       </w:tr>
       <w:tr>
+        <w:trPr>
+          <w:cantSplit/>
+        </w:trPr>
         <w:tc>
           <w:tcPr>
             <w:tcW w:w="600" w:type="dxa"/>
@@ -17269,6 +17644,9 @@
         </w:tc>
       </w:tr>
       <w:tr>
+        <w:trPr>
+          <w:cantSplit/>
+        </w:trPr>
         <w:tc>
           <w:tcPr>
             <w:tcW w:w="600" w:type="dxa"/>
@@ -17401,6 +17779,9 @@
         </w:tc>
       </w:tr>
       <w:tr>
+        <w:trPr>
+          <w:cantSplit/>
+        </w:trPr>
         <w:tc>
           <w:tcPr>
             <w:tcW w:w="600" w:type="dxa"/>
@@ -17528,6 +17909,9 @@
         </w:tc>
       </w:tr>
       <w:tr>
+        <w:trPr>
+          <w:cantSplit/>
+        </w:trPr>
         <w:tc>
           <w:tcPr>
             <w:tcW w:w="600" w:type="dxa"/>
@@ -17660,6 +18044,9 @@
         </w:tc>
       </w:tr>
       <w:tr>
+        <w:trPr>
+          <w:cantSplit/>
+        </w:trPr>
         <w:tc>
           <w:tcPr>
             <w:tcW w:w="600" w:type="dxa"/>
@@ -17787,6 +18174,9 @@
         </w:tc>
       </w:tr>
       <w:tr>
+        <w:trPr>
+          <w:cantSplit/>
+        </w:trPr>
         <w:tc>
           <w:tcPr>
             <w:tcW w:w="600" w:type="dxa"/>
@@ -17919,6 +18309,9 @@
         </w:tc>
       </w:tr>
       <w:tr>
+        <w:trPr>
+          <w:cantSplit/>
+        </w:trPr>
         <w:tc>
           <w:tcPr>
             <w:tcW w:w="600" w:type="dxa"/>
@@ -18046,6 +18439,9 @@
         </w:tc>
       </w:tr>
       <w:tr>
+        <w:trPr>
+          <w:cantSplit/>
+        </w:trPr>
         <w:tc>
           <w:tcPr>
             <w:tcW w:w="600" w:type="dxa"/>
@@ -18178,6 +18574,9 @@
         </w:tc>
       </w:tr>
       <w:tr>
+        <w:trPr>
+          <w:cantSplit/>
+        </w:trPr>
         <w:tc>
           <w:tcPr>
             <w:tcW w:w="600" w:type="dxa"/>
@@ -18305,6 +18704,9 @@
         </w:tc>
       </w:tr>
       <w:tr>
+        <w:trPr>
+          <w:cantSplit/>
+        </w:trPr>
         <w:tc>
           <w:tcPr>
             <w:tcW w:w="600" w:type="dxa"/>
@@ -18437,6 +18839,9 @@
         </w:tc>
       </w:tr>
       <w:tr>
+        <w:trPr>
+          <w:cantSplit/>
+        </w:trPr>
         <w:tc>
           <w:tcPr>
             <w:tcW w:w="600" w:type="dxa"/>
@@ -18564,6 +18969,9 @@
         </w:tc>
       </w:tr>
       <w:tr>
+        <w:trPr>
+          <w:cantSplit/>
+        </w:trPr>
         <w:tc>
           <w:tcPr>
             <w:tcW w:w="600" w:type="dxa"/>
@@ -18696,6 +19104,9 @@
         </w:tc>
       </w:tr>
       <w:tr>
+        <w:trPr>
+          <w:cantSplit/>
+        </w:trPr>
         <w:tc>
           <w:tcPr>
             <w:tcW w:w="600" w:type="dxa"/>
@@ -18823,6 +19234,9 @@
         </w:tc>
       </w:tr>
       <w:tr>
+        <w:trPr>
+          <w:cantSplit/>
+        </w:trPr>
         <w:tc>
           <w:tcPr>
             <w:tcW w:w="600" w:type="dxa"/>
@@ -18955,6 +19369,9 @@
         </w:tc>
       </w:tr>
       <w:tr>
+        <w:trPr>
+          <w:cantSplit/>
+        </w:trPr>
         <w:tc>
           <w:tcPr>
             <w:tcW w:w="600" w:type="dxa"/>
@@ -19084,7 +19501,8 @@
     </w:tbl>
     <w:p>
       <w:pPr>
-        <w:spacing w:before="200" w:after="80"/>
+        <w:pageBreakBefore/>
+        <w:spacing w:before="360" w:after="160"/>
         <w:keepNext/>
       </w:pPr>
       <w:r>
@@ -19120,6 +19538,7 @@
       <w:tr>
         <w:trPr>
           <w:tblHeader/>
+          <w:cantSplit/>
         </w:trPr>
         <w:tc>
           <w:tcPr>
@@ -19258,6 +19677,9 @@
         </w:tc>
       </w:tr>
       <w:tr>
+        <w:trPr>
+          <w:cantSplit/>
+        </w:trPr>
         <w:tc>
           <w:tcPr>
             <w:tcW w:w="600" w:type="dxa"/>
@@ -19385,6 +19807,9 @@
         </w:tc>
       </w:tr>
       <w:tr>
+        <w:trPr>
+          <w:cantSplit/>
+        </w:trPr>
         <w:tc>
           <w:tcPr>
             <w:tcW w:w="600" w:type="dxa"/>
@@ -19517,6 +19942,9 @@
         </w:tc>
       </w:tr>
       <w:tr>
+        <w:trPr>
+          <w:cantSplit/>
+        </w:trPr>
         <w:tc>
           <w:tcPr>
             <w:tcW w:w="600" w:type="dxa"/>
@@ -19644,6 +20072,9 @@
         </w:tc>
       </w:tr>
       <w:tr>
+        <w:trPr>
+          <w:cantSplit/>
+        </w:trPr>
         <w:tc>
           <w:tcPr>
             <w:tcW w:w="600" w:type="dxa"/>
@@ -19776,6 +20207,9 @@
         </w:tc>
       </w:tr>
       <w:tr>
+        <w:trPr>
+          <w:cantSplit/>
+        </w:trPr>
         <w:tc>
           <w:tcPr>
             <w:tcW w:w="600" w:type="dxa"/>
@@ -19903,6 +20337,9 @@
         </w:tc>
       </w:tr>
       <w:tr>
+        <w:trPr>
+          <w:cantSplit/>
+        </w:trPr>
         <w:tc>
           <w:tcPr>
             <w:tcW w:w="600" w:type="dxa"/>
@@ -20035,6 +20472,9 @@
         </w:tc>
       </w:tr>
       <w:tr>
+        <w:trPr>
+          <w:cantSplit/>
+        </w:trPr>
         <w:tc>
           <w:tcPr>
             <w:tcW w:w="600" w:type="dxa"/>
@@ -20162,6 +20602,9 @@
         </w:tc>
       </w:tr>
       <w:tr>
+        <w:trPr>
+          <w:cantSplit/>
+        </w:trPr>
         <w:tc>
           <w:tcPr>
             <w:tcW w:w="600" w:type="dxa"/>
@@ -20294,6 +20737,9 @@
         </w:tc>
       </w:tr>
       <w:tr>
+        <w:trPr>
+          <w:cantSplit/>
+        </w:trPr>
         <w:tc>
           <w:tcPr>
             <w:tcW w:w="600" w:type="dxa"/>
@@ -20423,7 +20869,8 @@
     </w:tbl>
     <w:p>
       <w:pPr>
-        <w:spacing w:before="200" w:after="80"/>
+        <w:pageBreakBefore/>
+        <w:spacing w:before="360" w:after="160"/>
         <w:keepNext/>
       </w:pPr>
       <w:r>
@@ -20459,6 +20906,7 @@
       <w:tr>
         <w:trPr>
           <w:tblHeader/>
+          <w:cantSplit/>
         </w:trPr>
         <w:tc>
           <w:tcPr>
@@ -20597,6 +21045,9 @@
         </w:tc>
       </w:tr>
       <w:tr>
+        <w:trPr>
+          <w:cantSplit/>
+        </w:trPr>
         <w:tc>
           <w:tcPr>
             <w:tcW w:w="600" w:type="dxa"/>
@@ -20724,6 +21175,9 @@
         </w:tc>
       </w:tr>
       <w:tr>
+        <w:trPr>
+          <w:cantSplit/>
+        </w:trPr>
         <w:tc>
           <w:tcPr>
             <w:tcW w:w="600" w:type="dxa"/>
@@ -20856,6 +21310,9 @@
         </w:tc>
       </w:tr>
       <w:tr>
+        <w:trPr>
+          <w:cantSplit/>
+        </w:trPr>
         <w:tc>
           <w:tcPr>
             <w:tcW w:w="600" w:type="dxa"/>
@@ -20983,6 +21440,9 @@
         </w:tc>
       </w:tr>
       <w:tr>
+        <w:trPr>
+          <w:cantSplit/>
+        </w:trPr>
         <w:tc>
           <w:tcPr>
             <w:tcW w:w="600" w:type="dxa"/>
@@ -21115,6 +21575,9 @@
         </w:tc>
       </w:tr>
       <w:tr>
+        <w:trPr>
+          <w:cantSplit/>
+        </w:trPr>
         <w:tc>
           <w:tcPr>
             <w:tcW w:w="600" w:type="dxa"/>
@@ -21242,6 +21705,9 @@
         </w:tc>
       </w:tr>
       <w:tr>
+        <w:trPr>
+          <w:cantSplit/>
+        </w:trPr>
         <w:tc>
           <w:tcPr>
             <w:tcW w:w="600" w:type="dxa"/>
@@ -21374,6 +21840,9 @@
         </w:tc>
       </w:tr>
       <w:tr>
+        <w:trPr>
+          <w:cantSplit/>
+        </w:trPr>
         <w:tc>
           <w:tcPr>
             <w:tcW w:w="600" w:type="dxa"/>
@@ -21501,6 +21970,9 @@
         </w:tc>
       </w:tr>
       <w:tr>
+        <w:trPr>
+          <w:cantSplit/>
+        </w:trPr>
         <w:tc>
           <w:tcPr>
             <w:tcW w:w="600" w:type="dxa"/>
@@ -21633,6 +22105,9 @@
         </w:tc>
       </w:tr>
       <w:tr>
+        <w:trPr>
+          <w:cantSplit/>
+        </w:trPr>
         <w:tc>
           <w:tcPr>
             <w:tcW w:w="600" w:type="dxa"/>
@@ -21760,6 +22235,9 @@
         </w:tc>
       </w:tr>
       <w:tr>
+        <w:trPr>
+          <w:cantSplit/>
+        </w:trPr>
         <w:tc>
           <w:tcPr>
             <w:tcW w:w="600" w:type="dxa"/>
@@ -21892,6 +22370,9 @@
         </w:tc>
       </w:tr>
       <w:tr>
+        <w:trPr>
+          <w:cantSplit/>
+        </w:trPr>
         <w:tc>
           <w:tcPr>
             <w:tcW w:w="600" w:type="dxa"/>
@@ -22019,6 +22500,9 @@
         </w:tc>
       </w:tr>
       <w:tr>
+        <w:trPr>
+          <w:cantSplit/>
+        </w:trPr>
         <w:tc>
           <w:tcPr>
             <w:tcW w:w="600" w:type="dxa"/>
@@ -22153,7 +22637,8 @@
     </w:tbl>
     <w:p>
       <w:pPr>
-        <w:spacing w:before="200" w:after="80"/>
+        <w:pageBreakBefore/>
+        <w:spacing w:before="360" w:after="160"/>
         <w:keepNext/>
       </w:pPr>
       <w:r>
@@ -22189,6 +22674,7 @@
       <w:tr>
         <w:trPr>
           <w:tblHeader/>
+          <w:cantSplit/>
         </w:trPr>
         <w:tc>
           <w:tcPr>
@@ -22327,6 +22813,9 @@
         </w:tc>
       </w:tr>
       <w:tr>
+        <w:trPr>
+          <w:cantSplit/>
+        </w:trPr>
         <w:tc>
           <w:tcPr>
             <w:tcW w:w="600" w:type="dxa"/>
@@ -22454,6 +22943,9 @@
         </w:tc>
       </w:tr>
       <w:tr>
+        <w:trPr>
+          <w:cantSplit/>
+        </w:trPr>
         <w:tc>
           <w:tcPr>
             <w:tcW w:w="600" w:type="dxa"/>
@@ -22586,6 +23078,9 @@
         </w:tc>
       </w:tr>
       <w:tr>
+        <w:trPr>
+          <w:cantSplit/>
+        </w:trPr>
         <w:tc>
           <w:tcPr>
             <w:tcW w:w="600" w:type="dxa"/>
@@ -22713,6 +23208,9 @@
         </w:tc>
       </w:tr>
       <w:tr>
+        <w:trPr>
+          <w:cantSplit/>
+        </w:trPr>
         <w:tc>
           <w:tcPr>
             <w:tcW w:w="600" w:type="dxa"/>
@@ -22845,6 +23343,9 @@
         </w:tc>
       </w:tr>
       <w:tr>
+        <w:trPr>
+          <w:cantSplit/>
+        </w:trPr>
         <w:tc>
           <w:tcPr>
             <w:tcW w:w="600" w:type="dxa"/>
@@ -22972,6 +23473,9 @@
         </w:tc>
       </w:tr>
       <w:tr>
+        <w:trPr>
+          <w:cantSplit/>
+        </w:trPr>
         <w:tc>
           <w:tcPr>
             <w:tcW w:w="600" w:type="dxa"/>
@@ -23104,6 +23608,9 @@
         </w:tc>
       </w:tr>
       <w:tr>
+        <w:trPr>
+          <w:cantSplit/>
+        </w:trPr>
         <w:tc>
           <w:tcPr>
             <w:tcW w:w="600" w:type="dxa"/>
@@ -23231,6 +23738,9 @@
         </w:tc>
       </w:tr>
       <w:tr>
+        <w:trPr>
+          <w:cantSplit/>
+        </w:trPr>
         <w:tc>
           <w:tcPr>
             <w:tcW w:w="600" w:type="dxa"/>
@@ -23363,6 +23873,9 @@
         </w:tc>
       </w:tr>
       <w:tr>
+        <w:trPr>
+          <w:cantSplit/>
+        </w:trPr>
         <w:tc>
           <w:tcPr>
             <w:tcW w:w="600" w:type="dxa"/>
@@ -23490,6 +24003,9 @@
         </w:tc>
       </w:tr>
       <w:tr>
+        <w:trPr>
+          <w:cantSplit/>
+        </w:trPr>
         <w:tc>
           <w:tcPr>
             <w:tcW w:w="600" w:type="dxa"/>
@@ -23622,6 +24138,9 @@
         </w:tc>
       </w:tr>
       <w:tr>
+        <w:trPr>
+          <w:cantSplit/>
+        </w:trPr>
         <w:tc>
           <w:tcPr>
             <w:tcW w:w="600" w:type="dxa"/>
@@ -23749,6 +24268,9 @@
         </w:tc>
       </w:tr>
       <w:tr>
+        <w:trPr>
+          <w:cantSplit/>
+        </w:trPr>
         <w:tc>
           <w:tcPr>
             <w:tcW w:w="600" w:type="dxa"/>
@@ -23881,6 +24403,9 @@
         </w:tc>
       </w:tr>
       <w:tr>
+        <w:trPr>
+          <w:cantSplit/>
+        </w:trPr>
         <w:tc>
           <w:tcPr>
             <w:tcW w:w="600" w:type="dxa"/>
@@ -24008,6 +24533,9 @@
         </w:tc>
       </w:tr>
       <w:tr>
+        <w:trPr>
+          <w:cantSplit/>
+        </w:trPr>
         <w:tc>
           <w:tcPr>
             <w:tcW w:w="600" w:type="dxa"/>
@@ -24140,6 +24668,9 @@
         </w:tc>
       </w:tr>
       <w:tr>
+        <w:trPr>
+          <w:cantSplit/>
+        </w:trPr>
         <w:tc>
           <w:tcPr>
             <w:tcW w:w="600" w:type="dxa"/>
@@ -24267,6 +24798,9 @@
         </w:tc>
       </w:tr>
       <w:tr>
+        <w:trPr>
+          <w:cantSplit/>
+        </w:trPr>
         <w:tc>
           <w:tcPr>
             <w:tcW w:w="600" w:type="dxa"/>
@@ -24399,6 +24933,9 @@
         </w:tc>
       </w:tr>
       <w:tr>
+        <w:trPr>
+          <w:cantSplit/>
+        </w:trPr>
         <w:tc>
           <w:tcPr>
             <w:tcW w:w="600" w:type="dxa"/>
@@ -24526,6 +25063,9 @@
         </w:tc>
       </w:tr>
       <w:tr>
+        <w:trPr>
+          <w:cantSplit/>
+        </w:trPr>
         <w:tc>
           <w:tcPr>
             <w:tcW w:w="600" w:type="dxa"/>
@@ -24658,6 +25198,9 @@
         </w:tc>
       </w:tr>
       <w:tr>
+        <w:trPr>
+          <w:cantSplit/>
+        </w:trPr>
         <w:tc>
           <w:tcPr>
             <w:tcW w:w="600" w:type="dxa"/>
@@ -24785,6 +25328,9 @@
         </w:tc>
       </w:tr>
       <w:tr>
+        <w:trPr>
+          <w:cantSplit/>
+        </w:trPr>
         <w:tc>
           <w:tcPr>
             <w:tcW w:w="600" w:type="dxa"/>
@@ -24917,6 +25463,9 @@
         </w:tc>
       </w:tr>
       <w:tr>
+        <w:trPr>
+          <w:cantSplit/>
+        </w:trPr>
         <w:tc>
           <w:tcPr>
             <w:tcW w:w="600" w:type="dxa"/>
@@ -25044,6 +25593,9 @@
         </w:tc>
       </w:tr>
       <w:tr>
+        <w:trPr>
+          <w:cantSplit/>
+        </w:trPr>
         <w:tc>
           <w:tcPr>
             <w:tcW w:w="600" w:type="dxa"/>
@@ -25176,6 +25728,9 @@
         </w:tc>
       </w:tr>
       <w:tr>
+        <w:trPr>
+          <w:cantSplit/>
+        </w:trPr>
         <w:tc>
           <w:tcPr>
             <w:tcW w:w="600" w:type="dxa"/>
@@ -25303,6 +25858,9 @@
         </w:tc>
       </w:tr>
       <w:tr>
+        <w:trPr>
+          <w:cantSplit/>
+        </w:trPr>
         <w:tc>
           <w:tcPr>
             <w:tcW w:w="600" w:type="dxa"/>
@@ -25435,6 +25993,9 @@
         </w:tc>
       </w:tr>
       <w:tr>
+        <w:trPr>
+          <w:cantSplit/>
+        </w:trPr>
         <w:tc>
           <w:tcPr>
             <w:tcW w:w="600" w:type="dxa"/>
@@ -25564,7 +26125,8 @@
     </w:tbl>
     <w:p>
       <w:pPr>
-        <w:spacing w:before="200" w:after="80"/>
+        <w:pageBreakBefore/>
+        <w:spacing w:before="360" w:after="160"/>
         <w:keepNext/>
       </w:pPr>
       <w:r>
@@ -25600,6 +26162,7 @@
       <w:tr>
         <w:trPr>
           <w:tblHeader/>
+          <w:cantSplit/>
         </w:trPr>
         <w:tc>
           <w:tcPr>
@@ -25738,6 +26301,9 @@
         </w:tc>
       </w:tr>
       <w:tr>
+        <w:trPr>
+          <w:cantSplit/>
+        </w:trPr>
         <w:tc>
           <w:tcPr>
             <w:tcW w:w="600" w:type="dxa"/>
@@ -25865,6 +26431,9 @@
         </w:tc>
       </w:tr>
       <w:tr>
+        <w:trPr>
+          <w:cantSplit/>
+        </w:trPr>
         <w:tc>
           <w:tcPr>
             <w:tcW w:w="600" w:type="dxa"/>
@@ -25997,6 +26566,9 @@
         </w:tc>
       </w:tr>
       <w:tr>
+        <w:trPr>
+          <w:cantSplit/>
+        </w:trPr>
         <w:tc>
           <w:tcPr>
             <w:tcW w:w="600" w:type="dxa"/>
@@ -26124,6 +26696,9 @@
         </w:tc>
       </w:tr>
       <w:tr>
+        <w:trPr>
+          <w:cantSplit/>
+        </w:trPr>
         <w:tc>
           <w:tcPr>
             <w:tcW w:w="600" w:type="dxa"/>
@@ -26256,6 +26831,9 @@
         </w:tc>
       </w:tr>
       <w:tr>
+        <w:trPr>
+          <w:cantSplit/>
+        </w:trPr>
         <w:tc>
           <w:tcPr>
             <w:tcW w:w="600" w:type="dxa"/>
@@ -26383,6 +26961,9 @@
         </w:tc>
       </w:tr>
       <w:tr>
+        <w:trPr>
+          <w:cantSplit/>
+        </w:trPr>
         <w:tc>
           <w:tcPr>
             <w:tcW w:w="600" w:type="dxa"/>
@@ -26515,6 +27096,9 @@
         </w:tc>
       </w:tr>
       <w:tr>
+        <w:trPr>
+          <w:cantSplit/>
+        </w:trPr>
         <w:tc>
           <w:tcPr>
             <w:tcW w:w="600" w:type="dxa"/>
@@ -26642,6 +27226,9 @@
         </w:tc>
       </w:tr>
       <w:tr>
+        <w:trPr>
+          <w:cantSplit/>
+        </w:trPr>
         <w:tc>
           <w:tcPr>
             <w:tcW w:w="600" w:type="dxa"/>
@@ -26774,6 +27361,9 @@
         </w:tc>
       </w:tr>
       <w:tr>
+        <w:trPr>
+          <w:cantSplit/>
+        </w:trPr>
         <w:tc>
           <w:tcPr>
             <w:tcW w:w="600" w:type="dxa"/>
@@ -26901,6 +27491,9 @@
         </w:tc>
       </w:tr>
       <w:tr>
+        <w:trPr>
+          <w:cantSplit/>
+        </w:trPr>
         <w:tc>
           <w:tcPr>
             <w:tcW w:w="600" w:type="dxa"/>
@@ -27033,6 +27626,9 @@
         </w:tc>
       </w:tr>
       <w:tr>
+        <w:trPr>
+          <w:cantSplit/>
+        </w:trPr>
         <w:tc>
           <w:tcPr>
             <w:tcW w:w="600" w:type="dxa"/>
@@ -27160,6 +27756,9 @@
         </w:tc>
       </w:tr>
       <w:tr>
+        <w:trPr>
+          <w:cantSplit/>
+        </w:trPr>
         <w:tc>
           <w:tcPr>
             <w:tcW w:w="600" w:type="dxa"/>
@@ -27294,7 +27893,8 @@
     </w:tbl>
     <w:p>
       <w:pPr>
-        <w:spacing w:before="200" w:after="80"/>
+        <w:pageBreakBefore/>
+        <w:spacing w:before="360" w:after="160"/>
         <w:keepNext/>
       </w:pPr>
       <w:r>
@@ -27330,6 +27930,7 @@
       <w:tr>
         <w:trPr>
           <w:tblHeader/>
+          <w:cantSplit/>
         </w:trPr>
         <w:tc>
           <w:tcPr>
@@ -27468,6 +28069,9 @@
         </w:tc>
       </w:tr>
       <w:tr>
+        <w:trPr>
+          <w:cantSplit/>
+        </w:trPr>
         <w:tc>
           <w:tcPr>
             <w:tcW w:w="600" w:type="dxa"/>
@@ -27595,6 +28199,9 @@
         </w:tc>
       </w:tr>
       <w:tr>
+        <w:trPr>
+          <w:cantSplit/>
+        </w:trPr>
         <w:tc>
           <w:tcPr>
             <w:tcW w:w="600" w:type="dxa"/>
@@ -27727,6 +28334,9 @@
         </w:tc>
       </w:tr>
       <w:tr>
+        <w:trPr>
+          <w:cantSplit/>
+        </w:trPr>
         <w:tc>
           <w:tcPr>
             <w:tcW w:w="600" w:type="dxa"/>
@@ -27854,6 +28464,9 @@
         </w:tc>
       </w:tr>
       <w:tr>
+        <w:trPr>
+          <w:cantSplit/>
+        </w:trPr>
         <w:tc>
           <w:tcPr>
             <w:tcW w:w="600" w:type="dxa"/>
@@ -27986,6 +28599,9 @@
         </w:tc>
       </w:tr>
       <w:tr>
+        <w:trPr>
+          <w:cantSplit/>
+        </w:trPr>
         <w:tc>
           <w:tcPr>
             <w:tcW w:w="600" w:type="dxa"/>
@@ -28113,6 +28729,9 @@
         </w:tc>
       </w:tr>
       <w:tr>
+        <w:trPr>
+          <w:cantSplit/>
+        </w:trPr>
         <w:tc>
           <w:tcPr>
             <w:tcW w:w="600" w:type="dxa"/>
@@ -28245,6 +28864,9 @@
         </w:tc>
       </w:tr>
       <w:tr>
+        <w:trPr>
+          <w:cantSplit/>
+        </w:trPr>
         <w:tc>
           <w:tcPr>
             <w:tcW w:w="600" w:type="dxa"/>
@@ -28372,6 +28994,9 @@
         </w:tc>
       </w:tr>
       <w:tr>
+        <w:trPr>
+          <w:cantSplit/>
+        </w:trPr>
         <w:tc>
           <w:tcPr>
             <w:tcW w:w="600" w:type="dxa"/>
@@ -28501,7 +29126,8 @@
     </w:tbl>
     <w:p>
       <w:pPr>
-        <w:spacing w:before="200" w:after="80"/>
+        <w:pageBreakBefore/>
+        <w:spacing w:before="360" w:after="160"/>
         <w:keepNext/>
       </w:pPr>
       <w:r>
@@ -28537,6 +29163,7 @@
       <w:tr>
         <w:trPr>
           <w:tblHeader/>
+          <w:cantSplit/>
         </w:trPr>
         <w:tc>
           <w:tcPr>
@@ -28675,6 +29302,9 @@
         </w:tc>
       </w:tr>
       <w:tr>
+        <w:trPr>
+          <w:cantSplit/>
+        </w:trPr>
         <w:tc>
           <w:tcPr>
             <w:tcW w:w="600" w:type="dxa"/>
@@ -28802,6 +29432,9 @@
         </w:tc>
       </w:tr>
       <w:tr>
+        <w:trPr>
+          <w:cantSplit/>
+        </w:trPr>
         <w:tc>
           <w:tcPr>
             <w:tcW w:w="600" w:type="dxa"/>
@@ -28934,6 +29567,9 @@
         </w:tc>
       </w:tr>
       <w:tr>
+        <w:trPr>
+          <w:cantSplit/>
+        </w:trPr>
         <w:tc>
           <w:tcPr>
             <w:tcW w:w="600" w:type="dxa"/>
@@ -29061,6 +29697,9 @@
         </w:tc>
       </w:tr>
       <w:tr>
+        <w:trPr>
+          <w:cantSplit/>
+        </w:trPr>
         <w:tc>
           <w:tcPr>
             <w:tcW w:w="600" w:type="dxa"/>
@@ -29193,6 +29832,9 @@
         </w:tc>
       </w:tr>
       <w:tr>
+        <w:trPr>
+          <w:cantSplit/>
+        </w:trPr>
         <w:tc>
           <w:tcPr>
             <w:tcW w:w="600" w:type="dxa"/>
@@ -29320,6 +29962,9 @@
         </w:tc>
       </w:tr>
       <w:tr>
+        <w:trPr>
+          <w:cantSplit/>
+        </w:trPr>
         <w:tc>
           <w:tcPr>
             <w:tcW w:w="600" w:type="dxa"/>
@@ -29452,6 +30097,9 @@
         </w:tc>
       </w:tr>
       <w:tr>
+        <w:trPr>
+          <w:cantSplit/>
+        </w:trPr>
         <w:tc>
           <w:tcPr>
             <w:tcW w:w="600" w:type="dxa"/>
@@ -29579,6 +30227,9 @@
         </w:tc>
       </w:tr>
       <w:tr>
+        <w:trPr>
+          <w:cantSplit/>
+        </w:trPr>
         <w:tc>
           <w:tcPr>
             <w:tcW w:w="600" w:type="dxa"/>
@@ -29711,6 +30362,9 @@
         </w:tc>
       </w:tr>
       <w:tr>
+        <w:trPr>
+          <w:cantSplit/>
+        </w:trPr>
         <w:tc>
           <w:tcPr>
             <w:tcW w:w="600" w:type="dxa"/>
@@ -29838,6 +30492,9 @@
         </w:tc>
       </w:tr>
       <w:tr>
+        <w:trPr>
+          <w:cantSplit/>
+        </w:trPr>
         <w:tc>
           <w:tcPr>
             <w:tcW w:w="600" w:type="dxa"/>
@@ -29970,6 +30627,9 @@
         </w:tc>
       </w:tr>
       <w:tr>
+        <w:trPr>
+          <w:cantSplit/>
+        </w:trPr>
         <w:tc>
           <w:tcPr>
             <w:tcW w:w="600" w:type="dxa"/>
@@ -30097,6 +30757,9 @@
         </w:tc>
       </w:tr>
       <w:tr>
+        <w:trPr>
+          <w:cantSplit/>
+        </w:trPr>
         <w:tc>
           <w:tcPr>
             <w:tcW w:w="600" w:type="dxa"/>
@@ -30229,6 +30892,9 @@
         </w:tc>
       </w:tr>
       <w:tr>
+        <w:trPr>
+          <w:cantSplit/>
+        </w:trPr>
         <w:tc>
           <w:tcPr>
             <w:tcW w:w="600" w:type="dxa"/>
@@ -30358,7 +31024,8 @@
     </w:tbl>
     <w:p>
       <w:pPr>
-        <w:spacing w:before="200" w:after="80"/>
+        <w:pageBreakBefore/>
+        <w:spacing w:before="360" w:after="160"/>
         <w:keepNext/>
       </w:pPr>
       <w:r>
@@ -30394,6 +31061,7 @@
       <w:tr>
         <w:trPr>
           <w:tblHeader/>
+          <w:cantSplit/>
         </w:trPr>
         <w:tc>
           <w:tcPr>
@@ -30532,6 +31200,9 @@
         </w:tc>
       </w:tr>
       <w:tr>
+        <w:trPr>
+          <w:cantSplit/>
+        </w:trPr>
         <w:tc>
           <w:tcPr>
             <w:tcW w:w="600" w:type="dxa"/>
@@ -30659,6 +31330,9 @@
         </w:tc>
       </w:tr>
       <w:tr>
+        <w:trPr>
+          <w:cantSplit/>
+        </w:trPr>
         <w:tc>
           <w:tcPr>
             <w:tcW w:w="600" w:type="dxa"/>
@@ -30791,6 +31465,9 @@
         </w:tc>
       </w:tr>
       <w:tr>
+        <w:trPr>
+          <w:cantSplit/>
+        </w:trPr>
         <w:tc>
           <w:tcPr>
             <w:tcW w:w="600" w:type="dxa"/>
@@ -30918,6 +31595,9 @@
         </w:tc>
       </w:tr>
       <w:tr>
+        <w:trPr>
+          <w:cantSplit/>
+        </w:trPr>
         <w:tc>
           <w:tcPr>
             <w:tcW w:w="600" w:type="dxa"/>
@@ -31050,6 +31730,9 @@
         </w:tc>
       </w:tr>
       <w:tr>
+        <w:trPr>
+          <w:cantSplit/>
+        </w:trPr>
         <w:tc>
           <w:tcPr>
             <w:tcW w:w="600" w:type="dxa"/>
@@ -31177,6 +31860,9 @@
         </w:tc>
       </w:tr>
       <w:tr>
+        <w:trPr>
+          <w:cantSplit/>
+        </w:trPr>
         <w:tc>
           <w:tcPr>
             <w:tcW w:w="600" w:type="dxa"/>
@@ -31309,6 +31995,9 @@
         </w:tc>
       </w:tr>
       <w:tr>
+        <w:trPr>
+          <w:cantSplit/>
+        </w:trPr>
         <w:tc>
           <w:tcPr>
             <w:tcW w:w="600" w:type="dxa"/>

</xml_diff>